<commit_message>
Update CHANGELOG for version 1.0.22 and correct founding date of the community
- Added details for version 1.0.22, including the correction of the founding date from 2012 in Cali to 2019 in Colombia, as confirmed by the Venerable Maestro Zheng Gong.
- Updated JSON-LD in `index.html` and `comunidad/index.html` to reflect the accurate founding date and location.
- Revised documentation in `docs/informes-seo/02-auditoria-seo-tecnica.md` and other related files to ensure consistency with the corrected information.
- Updated `<lastmod>` dates in `sitemap.xml` for all affected pages to reflect the latest changes.

Co-authored-by: Cursor <cursoragent@cursor.com>
</commit_message>
<xml_diff>
--- a/docs/informes-seo/02-auditoria-seo-tecnica.docx
+++ b/docs/informes-seo/02-auditoria-seo-tecnica.docx
@@ -294,7 +294,7 @@
             <w:r>
               <w:t xml:space="preserve">Rafael Figueredo Oropeza — </w:t>
             </w:r>
-            <w:hyperlink w:history="1" r:id="rIdblwuu-g6kv0jupbxpfshu">
+            <w:hyperlink w:history="1" r:id="rIdeerbcmximnwv_j8ju0s8d">
               <w:r>
                 <w:rPr>
                   <w:color w:val="8C2B3D"/>
@@ -306,7 +306,7 @@
             <w:r>
               <w:t xml:space="preserve"> · </w:t>
             </w:r>
-            <w:hyperlink w:history="1" r:id="rIdw7samrtkt0khtiprju989">
+            <w:hyperlink w:history="1" r:id="rId-xyyyun2ox_h_hqv5or_f">
               <w:r>
                 <w:rPr>
                   <w:color w:val="8C2B3D"/>
@@ -713,7 +713,7 @@
         <w:t xml:space="preserve">caminodeldharma.org</w:t>
       </w:r>
       <w:r>
-        <w:t xml:space="preserve"> es el sitio de la Comunidad Buddhista Camino del Dharma, una comunidad budista sin ánimo de lucro fundada en Cali en 2012, de tradición Chan y Tierra Pura. El sitio informa sobre la comunidad, su linaje y su práctica, publica eventos y un blog, y canaliza el contacto de quien quiere acercarse. </w:t>
+        <w:t xml:space="preserve"> es el sitio de la Comunidad Buddhista Camino del Dharma, una comunidad budista sin ánimo de lucro fundada en Colombia en 2019, de tradición Chan y Tierra Pura. El sitio informa sobre la comunidad, su linaje y su práctica, publica eventos y un blog, y canaliza el contacto de quien quiere acercarse. </w:t>
       </w:r>
       <w:r>
         <w:rPr>
@@ -7844,7 +7844,7 @@
               <w:jc w:val="left"/>
             </w:pPr>
             <w:r>
-              <w:t xml:space="preserve">Correcto — incluye fundación 2012, origen Cali y áreas de conocimiento</w:t>
+              <w:t xml:space="preserve">Correcto — incluye fundación 2019, origen Colombia y áreas de conocimiento</w:t>
             </w:r>
           </w:p>
         </w:tc>
@@ -8114,7 +8114,7 @@
         <w:t xml:space="preserve">foundingDate</w:t>
       </w:r>
       <w:r>
-        <w:t xml:space="preserve"> 2012, </w:t>
+        <w:t xml:space="preserve"> 2019, </w:t>
       </w:r>
       <w:r>
         <w:rPr>
@@ -8127,7 +8127,7 @@
         <w:t xml:space="preserve">foundingLocation</w:t>
       </w:r>
       <w:r>
-        <w:t xml:space="preserve"> Cali y </w:t>
+        <w:t xml:space="preserve"> Colombia y </w:t>
       </w:r>
       <w:r>
         <w:rPr>
@@ -8154,6 +8154,44 @@
       </w:r>
       <w:r>
         <w:t xml:space="preserve">.</w:t>
+      </w:r>
+    </w:p>
+    <w:p>
+      <w:pPr>
+        <w:pStyle w:val="Callout"/>
+      </w:pPr>
+      <w:r>
+        <w:rPr>
+          <w:b/>
+          <w:bCs/>
+        </w:rPr>
+        <w:t xml:space="preserve">Corrección del 2026-07-28.</w:t>
+      </w:r>
+      <w:r>
+        <w:t xml:space="preserve"> Estos datos de fundación se publicaron primero como «Cali, 2012», tomados de una fuente externa (el artículo de Buddhistdoor, EVID-0035). </w:t>
+      </w:r>
+      <w:r>
+        <w:rPr>
+          <w:b/>
+          <w:bCs/>
+        </w:rPr>
+        <w:t xml:space="preserve">La comunidad los corrigió: la fundación fue en Colombia, en 2019.</w:t>
+      </w:r>
+      <w:r>
+        <w:t xml:space="preserve"> Se rectificaron el JSON-LD de la portada y las menciones visibles de portada y </w:t>
+      </w:r>
+      <w:r>
+        <w:rPr>
+          <w:rFonts w:ascii="Roboto Mono" w:cs="Roboto Mono" w:eastAsia="Roboto Mono" w:hAnsi="Roboto Mono"/>
+          <w:color w:val="8C2B3D"/>
+          <w:sz w:val="19"/>
+          <w:szCs w:val="19"/>
+          <w:shd w:fill="F6F0EF" w:val="clear"/>
+        </w:rPr>
+        <w:t xml:space="preserve">/comunidad</w:t>
+      </w:r>
+      <w:r>
+        <w:t xml:space="preserve">. La fuente externa sigue publicando el dato erróneo — conviene incluir la corrección en el contacto de enlaces previsto en TASK-0014.</w:t>
       </w:r>
     </w:p>
     <w:p>
@@ -11152,7 +11190,7 @@
         </w:rPr>
         <w:t xml:space="preserve">La </w:t>
       </w:r>
-      <w:hyperlink w:history="1" r:id="rIdtnuracziudccvn0rvsiff">
+      <w:hyperlink w:history="1" r:id="rIdvulnh8kcrk4gud3e1ey7w">
         <w:r>
           <w:rPr>
             <w:b/>
@@ -11193,7 +11231,7 @@
       <w:r>
         <w:t xml:space="preserve"> en la </w:t>
       </w:r>
-      <w:hyperlink w:history="1" r:id="rIdhypbcbwvmd04xifiase1b">
+      <w:hyperlink w:history="1" r:id="rIdokaippt1_k2p29nv6hqgs">
         <w:r>
           <w:rPr>
             <w:color w:val="8C2B3D"/>

</xml_diff>